<commit_message>
Añadidos contenidos de ley de Ohm
</commit_message>
<xml_diff>
--- a/multichoice/build/es_electric_ohms_law.docx
+++ b/multichoice/build/es_electric_ohms_law.docx
@@ -7,7 +7,7 @@
         <w:pStyle w:val="Heading1"/>
       </w:pPr>
       <w:r>
-        <w:t>Electricidad. Ley de Ohm.</w:t>
+        <w:t>Electricidad. Ley de Ohm básica.</w:t>
       </w:r>
     </w:p>
     <w:p>
@@ -15,17 +15,1073 @@
         <w:pStyle w:val="ListNumber"/>
       </w:pPr>
       <w:r>
-        <w:t>¿Cuál será el voltaje en el punto 'a'?</w:t>
+        <w:t>¿Qué mide la energía con la que se impulsan los electrones?</w:t>
       </w:r>
     </w:p>
     <w:p>
       <w:pPr>
+        <w:pStyle w:val="Choice"/>
+      </w:pPr>
+      <w:r>
+        <w:t>a)</w:t>
+        <w:tab/>
+        <w:t>La resistencia eléctrica</w:t>
+      </w:r>
+    </w:p>
+    <w:p>
+      <w:pPr>
+        <w:pStyle w:val="Choice"/>
+      </w:pPr>
+      <w:r>
+        <w:t>b)</w:t>
+        <w:tab/>
+        <w:t>La tensión eléctrica</w:t>
+      </w:r>
+    </w:p>
+    <w:p>
+      <w:pPr>
+        <w:pStyle w:val="Choice"/>
+      </w:pPr>
+      <w:r>
+        <w:t>c)</w:t>
+        <w:tab/>
+        <w:t>La intensidad de corriente</w:t>
+      </w:r>
+    </w:p>
+    <w:p>
+      <w:pPr>
+        <w:pStyle w:val="Choice"/>
+      </w:pPr>
+      <w:r>
+        <w:t>d)</w:t>
+        <w:tab/>
+        <w:t>La potencia eléctrica</w:t>
+      </w:r>
+    </w:p>
+    <w:p>
+      <w:pPr>
+        <w:pStyle w:val="ListNumber"/>
+      </w:pPr>
+      <w:r>
+        <w:t>¿Qué mide la cantidad de electrones que circulan por segundo?</w:t>
+      </w:r>
+    </w:p>
+    <w:p>
+      <w:pPr>
+        <w:pStyle w:val="Choice"/>
+      </w:pPr>
+      <w:r>
+        <w:t>a)</w:t>
+        <w:tab/>
+        <w:t>La resistencia eléctrica</w:t>
+      </w:r>
+    </w:p>
+    <w:p>
+      <w:pPr>
+        <w:pStyle w:val="Choice"/>
+      </w:pPr>
+      <w:r>
+        <w:t>b)</w:t>
+        <w:tab/>
+        <w:t>La intensidad de corriente</w:t>
+      </w:r>
+    </w:p>
+    <w:p>
+      <w:pPr>
+        <w:pStyle w:val="Choice"/>
+      </w:pPr>
+      <w:r>
+        <w:t>c)</w:t>
+        <w:tab/>
+        <w:t>La tensión eléctrica</w:t>
+      </w:r>
+    </w:p>
+    <w:p>
+      <w:pPr>
+        <w:pStyle w:val="Choice"/>
+      </w:pPr>
+      <w:r>
+        <w:t>d)</w:t>
+        <w:tab/>
+        <w:t>La potencia eléctrica</w:t>
+      </w:r>
+    </w:p>
+    <w:p>
+      <w:pPr>
+        <w:pStyle w:val="ListNumber"/>
+      </w:pPr>
+      <w:r>
+        <w:t>¿Qué mide la oposición al paso de la corriente eléctrica?</w:t>
+      </w:r>
+    </w:p>
+    <w:p>
+      <w:pPr>
+        <w:pStyle w:val="Choice"/>
+      </w:pPr>
+      <w:r>
+        <w:t>a)</w:t>
+        <w:tab/>
+        <w:t>La intensidad de corriente</w:t>
+      </w:r>
+    </w:p>
+    <w:p>
+      <w:pPr>
+        <w:pStyle w:val="Choice"/>
+      </w:pPr>
+      <w:r>
+        <w:t>b)</w:t>
+        <w:tab/>
+        <w:t>La tensión eléctrica</w:t>
+      </w:r>
+    </w:p>
+    <w:p>
+      <w:pPr>
+        <w:pStyle w:val="Choice"/>
+      </w:pPr>
+      <w:r>
+        <w:t>c)</w:t>
+        <w:tab/>
+        <w:t>La resistencia eléctrica</w:t>
+      </w:r>
+    </w:p>
+    <w:p>
+      <w:pPr>
+        <w:pStyle w:val="Choice"/>
+      </w:pPr>
+      <w:r>
+        <w:t>d)</w:t>
+        <w:tab/>
+        <w:t>La potencia eléctrica</w:t>
+      </w:r>
+    </w:p>
+    <w:p>
+      <w:pPr>
+        <w:pStyle w:val="ListNumber"/>
+      </w:pPr>
+      <w:r>
+        <w:t>¿Qué magnitud está midiendo un valor de 10V?</w:t>
+      </w:r>
+    </w:p>
+    <w:p>
+      <w:pPr>
+        <w:pStyle w:val="Choice"/>
+      </w:pPr>
+      <w:r>
+        <w:t>a)</w:t>
+        <w:tab/>
+        <w:t>Potencia eléctrica</w:t>
+      </w:r>
+    </w:p>
+    <w:p>
+      <w:pPr>
+        <w:pStyle w:val="Choice"/>
+      </w:pPr>
+      <w:r>
+        <w:t>b)</w:t>
+        <w:tab/>
+        <w:t>Intensidad de corriente</w:t>
+      </w:r>
+    </w:p>
+    <w:p>
+      <w:pPr>
+        <w:pStyle w:val="Choice"/>
+      </w:pPr>
+      <w:r>
+        <w:t>c)</w:t>
+        <w:tab/>
+        <w:t>Tensión eléctrica</w:t>
+      </w:r>
+    </w:p>
+    <w:p>
+      <w:pPr>
+        <w:pStyle w:val="Choice"/>
+      </w:pPr>
+      <w:r>
+        <w:t>d)</w:t>
+        <w:tab/>
+        <w:t>Resistencia eléctrica</w:t>
+      </w:r>
+    </w:p>
+    <w:p>
+      <w:pPr>
+        <w:pStyle w:val="ListNumber"/>
+      </w:pPr>
+      <w:r>
+        <w:t>¿Qué magnitud está midiendo un valor de 10A?</w:t>
+      </w:r>
+    </w:p>
+    <w:p>
+      <w:pPr>
+        <w:pStyle w:val="Choice"/>
+      </w:pPr>
+      <w:r>
+        <w:t>a)</w:t>
+        <w:tab/>
+        <w:t>Intensidad de corriente</w:t>
+      </w:r>
+    </w:p>
+    <w:p>
+      <w:pPr>
+        <w:pStyle w:val="Choice"/>
+      </w:pPr>
+      <w:r>
+        <w:t>b)</w:t>
+        <w:tab/>
+        <w:t>Tensión eléctrica</w:t>
+      </w:r>
+    </w:p>
+    <w:p>
+      <w:pPr>
+        <w:pStyle w:val="Choice"/>
+      </w:pPr>
+      <w:r>
+        <w:t>c)</w:t>
+        <w:tab/>
+        <w:t>Potencia eléctrica</w:t>
+      </w:r>
+    </w:p>
+    <w:p>
+      <w:pPr>
+        <w:pStyle w:val="Choice"/>
+      </w:pPr>
+      <w:r>
+        <w:t>d)</w:t>
+        <w:tab/>
+        <w:t>Resistencia eléctrica</w:t>
+      </w:r>
+    </w:p>
+    <w:p>
+      <w:pPr>
+        <w:pStyle w:val="ListNumber"/>
+      </w:pPr>
+      <w:r>
+        <w:t>¿Qué magnitud está midiendo un valor de 10Ω?</w:t>
+      </w:r>
+    </w:p>
+    <w:p>
+      <w:pPr>
+        <w:pStyle w:val="Choice"/>
+      </w:pPr>
+      <w:r>
+        <w:t>a)</w:t>
+        <w:tab/>
+        <w:t>Resistencia eléctrica</w:t>
+      </w:r>
+    </w:p>
+    <w:p>
+      <w:pPr>
+        <w:pStyle w:val="Choice"/>
+      </w:pPr>
+      <w:r>
+        <w:t>b)</w:t>
+        <w:tab/>
+        <w:t>Potencia eléctrica</w:t>
+      </w:r>
+    </w:p>
+    <w:p>
+      <w:pPr>
+        <w:pStyle w:val="Choice"/>
+      </w:pPr>
+      <w:r>
+        <w:t>c)</w:t>
+        <w:tab/>
+        <w:t>Tensión eléctrica</w:t>
+      </w:r>
+    </w:p>
+    <w:p>
+      <w:pPr>
+        <w:pStyle w:val="Choice"/>
+      </w:pPr>
+      <w:r>
+        <w:t>d)</w:t>
+        <w:tab/>
+        <w:t>Intensidad de corriente</w:t>
+      </w:r>
+    </w:p>
+    <w:p>
+      <w:pPr>
+        <w:pStyle w:val="ListNumber"/>
+      </w:pPr>
+      <w:r>
+        <w:t>¿Qué unidad se utiliza para medir tensión eléctrica?</w:t>
+      </w:r>
+    </w:p>
+    <w:p>
+      <w:pPr>
+        <w:pStyle w:val="Choice"/>
+      </w:pPr>
+      <w:r>
+        <w:t>a)</w:t>
+        <w:tab/>
+        <w:t>Amperios</w:t>
+      </w:r>
+    </w:p>
+    <w:p>
+      <w:pPr>
+        <w:pStyle w:val="Choice"/>
+      </w:pPr>
+      <w:r>
+        <w:t>b)</w:t>
+        <w:tab/>
+        <w:t>Voltios</w:t>
+      </w:r>
+    </w:p>
+    <w:p>
+      <w:pPr>
+        <w:pStyle w:val="Choice"/>
+      </w:pPr>
+      <w:r>
+        <w:t>c)</w:t>
+        <w:tab/>
+        <w:t>Vatios</w:t>
+      </w:r>
+    </w:p>
+    <w:p>
+      <w:pPr>
+        <w:pStyle w:val="Choice"/>
+      </w:pPr>
+      <w:r>
+        <w:t>d)</w:t>
+        <w:tab/>
+        <w:t>Ohmios</w:t>
+      </w:r>
+    </w:p>
+    <w:p>
+      <w:pPr>
+        <w:pStyle w:val="ListNumber"/>
+      </w:pPr>
+      <w:r>
+        <w:t>¿Qué unidad se utiliza para medir intensidad de corriente?</w:t>
+      </w:r>
+    </w:p>
+    <w:p>
+      <w:pPr>
+        <w:pStyle w:val="Choice"/>
+      </w:pPr>
+      <w:r>
+        <w:t>a)</w:t>
+        <w:tab/>
+        <w:t>Vatios</w:t>
+      </w:r>
+    </w:p>
+    <w:p>
+      <w:pPr>
+        <w:pStyle w:val="Choice"/>
+      </w:pPr>
+      <w:r>
+        <w:t>b)</w:t>
+        <w:tab/>
+        <w:t>Voltios</w:t>
+      </w:r>
+    </w:p>
+    <w:p>
+      <w:pPr>
+        <w:pStyle w:val="Choice"/>
+      </w:pPr>
+      <w:r>
+        <w:t>c)</w:t>
+        <w:tab/>
+        <w:t>Ohmios</w:t>
+      </w:r>
+    </w:p>
+    <w:p>
+      <w:pPr>
+        <w:pStyle w:val="Choice"/>
+      </w:pPr>
+      <w:r>
+        <w:t>d)</w:t>
+        <w:tab/>
+        <w:t>Amperios</w:t>
+      </w:r>
+    </w:p>
+    <w:p>
+      <w:pPr>
+        <w:pStyle w:val="ListNumber"/>
+      </w:pPr>
+      <w:r>
+        <w:t>¿Qué unidad se utiliza para medir resistencia eléctrica?</w:t>
+      </w:r>
+    </w:p>
+    <w:p>
+      <w:pPr>
+        <w:pStyle w:val="Choice"/>
+      </w:pPr>
+      <w:r>
+        <w:t>a)</w:t>
+        <w:tab/>
+        <w:t>Ohmios</w:t>
+      </w:r>
+    </w:p>
+    <w:p>
+      <w:pPr>
+        <w:pStyle w:val="Choice"/>
+      </w:pPr>
+      <w:r>
+        <w:t>b)</w:t>
+        <w:tab/>
+        <w:t>Amperios</w:t>
+      </w:r>
+    </w:p>
+    <w:p>
+      <w:pPr>
+        <w:pStyle w:val="Choice"/>
+      </w:pPr>
+      <w:r>
+        <w:t>c)</w:t>
+        <w:tab/>
+        <w:t>Vatios</w:t>
+      </w:r>
+    </w:p>
+    <w:p>
+      <w:pPr>
+        <w:pStyle w:val="Choice"/>
+      </w:pPr>
+      <w:r>
+        <w:t>d)</w:t>
+        <w:tab/>
+        <w:t>Voltios</w:t>
+      </w:r>
+    </w:p>
+    <w:p>
+      <w:pPr>
+        <w:pStyle w:val="ListNumber"/>
+      </w:pPr>
+      <w:r>
+        <w:t>¿Según la ley de Ohm la intensidad de corriente es proporcional a?</w:t>
+      </w:r>
+    </w:p>
+    <w:p>
+      <w:pPr>
+        <w:pStyle w:val="Choice"/>
+      </w:pPr>
+      <w:r>
+        <w:t>a)</w:t>
+        <w:tab/>
+        <w:t>La potencia eléctrica</w:t>
+      </w:r>
+    </w:p>
+    <w:p>
+      <w:pPr>
+        <w:pStyle w:val="Choice"/>
+      </w:pPr>
+      <w:r>
+        <w:t>b)</w:t>
+        <w:tab/>
+        <w:t>La distancia</w:t>
+      </w:r>
+    </w:p>
+    <w:p>
+      <w:pPr>
+        <w:pStyle w:val="Choice"/>
+      </w:pPr>
+      <w:r>
+        <w:t>c)</w:t>
+        <w:tab/>
+        <w:t>La tensión eléctrica</w:t>
+      </w:r>
+    </w:p>
+    <w:p>
+      <w:pPr>
+        <w:pStyle w:val="Choice"/>
+      </w:pPr>
+      <w:r>
+        <w:t>d)</w:t>
+        <w:tab/>
+        <w:t>La resistencia eléctrica</w:t>
+      </w:r>
+    </w:p>
+    <w:p>
+      <w:pPr>
+        <w:pStyle w:val="ListNumber"/>
+      </w:pPr>
+      <w:r>
+        <w:t>¿Según la ley de Ohm la intensidad de corriente es inversamente proporcional a?</w:t>
+      </w:r>
+    </w:p>
+    <w:p>
+      <w:pPr>
+        <w:pStyle w:val="Choice"/>
+      </w:pPr>
+      <w:r>
+        <w:t>a)</w:t>
+        <w:tab/>
+        <w:t>La energía eléctrica</w:t>
+      </w:r>
+    </w:p>
+    <w:p>
+      <w:pPr>
+        <w:pStyle w:val="Choice"/>
+      </w:pPr>
+      <w:r>
+        <w:t>b)</w:t>
+        <w:tab/>
+        <w:t>La resistencia eléctrica</w:t>
+      </w:r>
+    </w:p>
+    <w:p>
+      <w:pPr>
+        <w:pStyle w:val="Choice"/>
+      </w:pPr>
+      <w:r>
+        <w:t>c)</w:t>
+        <w:tab/>
+        <w:t>La potencia eléctrica</w:t>
+      </w:r>
+    </w:p>
+    <w:p>
+      <w:pPr>
+        <w:pStyle w:val="Choice"/>
+      </w:pPr>
+      <w:r>
+        <w:t>d)</w:t>
+        <w:tab/>
+        <w:t>La tensión eléctrica</w:t>
+      </w:r>
+    </w:p>
+    <w:p>
+      <w:pPr>
+        <w:pStyle w:val="ListNumber"/>
+      </w:pPr>
+      <w:r>
+        <w:t>¿Según la ley de Ohm la tensión eléctrica es proporcional a?</w:t>
+      </w:r>
+    </w:p>
+    <w:p>
+      <w:pPr>
+        <w:pStyle w:val="Choice"/>
+      </w:pPr>
+      <w:r>
+        <w:t>a)</w:t>
+        <w:tab/>
+        <w:t>La potencia eléctrica</w:t>
+      </w:r>
+    </w:p>
+    <w:p>
+      <w:pPr>
+        <w:pStyle w:val="Choice"/>
+      </w:pPr>
+      <w:r>
+        <w:t>b)</w:t>
+        <w:tab/>
+        <w:t>La distancia</w:t>
+      </w:r>
+    </w:p>
+    <w:p>
+      <w:pPr>
+        <w:pStyle w:val="Choice"/>
+      </w:pPr>
+      <w:r>
+        <w:t>c)</w:t>
+        <w:tab/>
+        <w:t>La capacidad eléctrica</w:t>
+      </w:r>
+    </w:p>
+    <w:p>
+      <w:pPr>
+        <w:pStyle w:val="Choice"/>
+      </w:pPr>
+      <w:r>
+        <w:t>d)</w:t>
+        <w:tab/>
+        <w:t>La intensidad de corriente y a la resistencia</w:t>
+      </w:r>
+    </w:p>
+    <w:p>
+      <w:pPr>
+        <w:pStyle w:val="ListNumber"/>
+      </w:pPr>
+      <w:r>
+        <w:t>De las siguientes fórmulas de la ley de Ohm ¿cuál es incorrecta?</w:t>
+      </w:r>
+    </w:p>
+    <w:p>
+      <w:pPr>
+        <w:pStyle w:val="Choice"/>
+      </w:pPr>
+      <w:r>
+        <w:t>a)</w:t>
+        <w:tab/>
+        <w:t>V = I · R</w:t>
+      </w:r>
+    </w:p>
+    <w:p>
+      <w:pPr>
+        <w:pStyle w:val="Choice"/>
+      </w:pPr>
+      <w:r>
+        <w:t>b)</w:t>
+        <w:tab/>
+        <w:t>R = V / I</w:t>
+      </w:r>
+    </w:p>
+    <w:p>
+      <w:pPr>
+        <w:pStyle w:val="Choice"/>
+      </w:pPr>
+      <w:r>
+        <w:t>c)</w:t>
+        <w:tab/>
+        <w:t>I = V · R</w:t>
+      </w:r>
+    </w:p>
+    <w:p>
+      <w:pPr>
+        <w:pStyle w:val="Choice"/>
+      </w:pPr>
+      <w:r>
+        <w:t>d)</w:t>
+        <w:tab/>
+        <w:t>I = V / R</w:t>
+      </w:r>
+    </w:p>
+    <w:p>
+      <w:pPr>
+        <w:pStyle w:val="ListNumber"/>
+      </w:pPr>
+      <w:r>
+        <w:t>De las siguientes fórmulas de la ley de Ohm ¿cuál es incorrecta?</w:t>
+      </w:r>
+    </w:p>
+    <w:p>
+      <w:pPr>
+        <w:pStyle w:val="Choice"/>
+      </w:pPr>
+      <w:r>
+        <w:t>a)</w:t>
+        <w:tab/>
+        <w:t>R = V / I</w:t>
+      </w:r>
+    </w:p>
+    <w:p>
+      <w:pPr>
+        <w:pStyle w:val="Choice"/>
+      </w:pPr>
+      <w:r>
+        <w:t>b)</w:t>
+        <w:tab/>
+        <w:t>V = I · R</w:t>
+      </w:r>
+    </w:p>
+    <w:p>
+      <w:pPr>
+        <w:pStyle w:val="Choice"/>
+      </w:pPr>
+      <w:r>
+        <w:t>c)</w:t>
+        <w:tab/>
+        <w:t>R = V · I</w:t>
+      </w:r>
+    </w:p>
+    <w:p>
+      <w:pPr>
+        <w:pStyle w:val="Choice"/>
+      </w:pPr>
+      <w:r>
+        <w:t>d)</w:t>
+        <w:tab/>
+        <w:t>I = V / R</w:t>
+      </w:r>
+    </w:p>
+    <w:p>
+      <w:pPr>
+        <w:pStyle w:val="ListNumber"/>
+      </w:pPr>
+      <w:r>
+        <w:t>De las siguientes fórmulas de la ley de Ohm ¿cuál es incorrecta?</w:t>
+      </w:r>
+    </w:p>
+    <w:p>
+      <w:pPr>
+        <w:pStyle w:val="Choice"/>
+      </w:pPr>
+      <w:r>
+        <w:t>a)</w:t>
+        <w:tab/>
+        <w:t>V = I · R</w:t>
+      </w:r>
+    </w:p>
+    <w:p>
+      <w:pPr>
+        <w:pStyle w:val="Choice"/>
+      </w:pPr>
+      <w:r>
+        <w:t>b)</w:t>
+        <w:tab/>
+        <w:t>I = R / V</w:t>
+      </w:r>
+    </w:p>
+    <w:p>
+      <w:pPr>
+        <w:pStyle w:val="Choice"/>
+      </w:pPr>
+      <w:r>
+        <w:t>c)</w:t>
+        <w:tab/>
+        <w:t>R = V / I</w:t>
+      </w:r>
+    </w:p>
+    <w:p>
+      <w:pPr>
+        <w:pStyle w:val="Choice"/>
+      </w:pPr>
+      <w:r>
+        <w:t>d)</w:t>
+        <w:tab/>
+        <w:t>I = V / R</w:t>
+      </w:r>
+    </w:p>
+    <w:p>
+      <w:pPr>
+        <w:pStyle w:val="ListNumber"/>
+      </w:pPr>
+      <w:r>
+        <w:t>De las siguientes fórmulas de la ley de Ohm ¿cuál es incorrecta?</w:t>
+      </w:r>
+    </w:p>
+    <w:p>
+      <w:pPr>
+        <w:pStyle w:val="Choice"/>
+      </w:pPr>
+      <w:r>
+        <w:t>a)</w:t>
+        <w:tab/>
+        <w:t>R = I / V</w:t>
+      </w:r>
+    </w:p>
+    <w:p>
+      <w:pPr>
+        <w:pStyle w:val="Choice"/>
+      </w:pPr>
+      <w:r>
+        <w:t>b)</w:t>
+        <w:tab/>
+        <w:t>I = V / R</w:t>
+      </w:r>
+    </w:p>
+    <w:p>
+      <w:pPr>
+        <w:pStyle w:val="Choice"/>
+      </w:pPr>
+      <w:r>
+        <w:t>c)</w:t>
+        <w:tab/>
+        <w:t>R = V / I</w:t>
+      </w:r>
+    </w:p>
+    <w:p>
+      <w:pPr>
+        <w:pStyle w:val="Choice"/>
+      </w:pPr>
+      <w:r>
+        <w:t>d)</w:t>
+        <w:tab/>
+        <w:t>V = I · R</w:t>
+      </w:r>
+    </w:p>
+    <w:p>
+      <w:pPr>
+        <w:pStyle w:val="ListNumber"/>
+      </w:pPr>
+      <w:r>
+        <w:t>De las siguientes fórmulas de la ley de Ohm ¿cuál es correcta?</w:t>
+      </w:r>
+    </w:p>
+    <w:p>
+      <w:pPr>
+        <w:pStyle w:val="Choice"/>
+      </w:pPr>
+      <w:r>
+        <w:t>a)</w:t>
+        <w:tab/>
+        <w:t>I = V · R</w:t>
+      </w:r>
+    </w:p>
+    <w:p>
+      <w:pPr>
+        <w:pStyle w:val="Choice"/>
+      </w:pPr>
+      <w:r>
+        <w:t>b)</w:t>
+        <w:tab/>
+        <w:t>V = I · R</w:t>
+      </w:r>
+    </w:p>
+    <w:p>
+      <w:pPr>
+        <w:pStyle w:val="Choice"/>
+      </w:pPr>
+      <w:r>
+        <w:t>c)</w:t>
+        <w:tab/>
+        <w:t>R = I / V</w:t>
+      </w:r>
+    </w:p>
+    <w:p>
+      <w:pPr>
+        <w:pStyle w:val="Choice"/>
+      </w:pPr>
+      <w:r>
+        <w:t>d)</w:t>
+        <w:tab/>
+        <w:t>R = V · I</w:t>
+      </w:r>
+    </w:p>
+    <w:p>
+      <w:pPr>
+        <w:pStyle w:val="ListNumber"/>
+      </w:pPr>
+      <w:r>
+        <w:t>De las siguientes fórmulas de la ley de Ohm ¿cuál es correcta?</w:t>
+      </w:r>
+    </w:p>
+    <w:p>
+      <w:pPr>
+        <w:pStyle w:val="Choice"/>
+      </w:pPr>
+      <w:r>
+        <w:t>a)</w:t>
+        <w:tab/>
+        <w:t>I = V / R</w:t>
+      </w:r>
+    </w:p>
+    <w:p>
+      <w:pPr>
+        <w:pStyle w:val="Choice"/>
+      </w:pPr>
+      <w:r>
+        <w:t>b)</w:t>
+        <w:tab/>
+        <w:t>R = I / V</w:t>
+      </w:r>
+    </w:p>
+    <w:p>
+      <w:pPr>
+        <w:pStyle w:val="Choice"/>
+      </w:pPr>
+      <w:r>
+        <w:t>c)</w:t>
+        <w:tab/>
+        <w:t>R = V · I</w:t>
+      </w:r>
+    </w:p>
+    <w:p>
+      <w:pPr>
+        <w:pStyle w:val="Choice"/>
+      </w:pPr>
+      <w:r>
+        <w:t>d)</w:t>
+        <w:tab/>
+        <w:t>I = R / V</w:t>
+      </w:r>
+    </w:p>
+    <w:p>
+      <w:pPr>
+        <w:pStyle w:val="ListNumber"/>
+      </w:pPr>
+      <w:r>
+        <w:t>En un circuito con una tensión fija sustituyes la resistencia por otra de mayor valor ¿Qué ocurrirá en el circuito?</w:t>
+      </w:r>
+    </w:p>
+    <w:p>
+      <w:pPr>
+        <w:pStyle w:val="Choice"/>
+      </w:pPr>
+      <w:r>
+        <w:t>a)</w:t>
+        <w:tab/>
+        <w:t>La cantidad de electrones que van a pasar por la resistencia cada unidad de tiempo aumentará</w:t>
+      </w:r>
+    </w:p>
+    <w:p>
+      <w:pPr>
+        <w:pStyle w:val="Choice"/>
+      </w:pPr>
+      <w:r>
+        <w:t>b)</w:t>
+        <w:tab/>
+        <w:t>La intensidad que pasa por la resistencia no se verá afectada</w:t>
+      </w:r>
+    </w:p>
+    <w:p>
+      <w:pPr>
+        <w:pStyle w:val="Choice"/>
+      </w:pPr>
+      <w:r>
+        <w:t>c)</w:t>
+        <w:tab/>
+        <w:t>La intensidad que pasa por la resistencia será mayor</w:t>
+      </w:r>
+    </w:p>
+    <w:p>
+      <w:pPr>
+        <w:pStyle w:val="Choice"/>
+      </w:pPr>
+      <w:r>
+        <w:t>d)</w:t>
+        <w:tab/>
+        <w:t>La intensidad que pasa por la resistencia será menor</w:t>
+      </w:r>
+    </w:p>
+    <w:p>
+      <w:pPr>
+        <w:pStyle w:val="ListNumber"/>
+      </w:pPr>
+      <w:r>
+        <w:t>En un circuito con una tensión fija sustituyes la resistencia por otra de menor valor ¿Qué ocurrirá en el circuito?</w:t>
+      </w:r>
+    </w:p>
+    <w:p>
+      <w:pPr>
+        <w:pStyle w:val="Choice"/>
+      </w:pPr>
+      <w:r>
+        <w:t>a)</w:t>
+        <w:tab/>
+        <w:t>La intensidad que pasa por la resistencia será mayor</w:t>
+      </w:r>
+    </w:p>
+    <w:p>
+      <w:pPr>
+        <w:pStyle w:val="Choice"/>
+      </w:pPr>
+      <w:r>
+        <w:t>b)</w:t>
+        <w:tab/>
+        <w:t>La intensidad que pasa por la resistencia no se verá afectada</w:t>
+      </w:r>
+    </w:p>
+    <w:p>
+      <w:pPr>
+        <w:pStyle w:val="Choice"/>
+      </w:pPr>
+      <w:r>
+        <w:t>c)</w:t>
+        <w:tab/>
+        <w:t>La intensidad que pasa por la resistencia será menor</w:t>
+      </w:r>
+    </w:p>
+    <w:p>
+      <w:pPr>
+        <w:pStyle w:val="Choice"/>
+      </w:pPr>
+      <w:r>
+        <w:t>d)</w:t>
+        <w:tab/>
+        <w:t>La cantidad de electrones que van a pasar por la resistencia cada unidad de tiempo disminuirá</w:t>
+      </w:r>
+    </w:p>
+    <w:p>
+      <w:pPr>
+        <w:pStyle w:val="ListNumber"/>
+      </w:pPr>
+      <w:r>
+        <w:t>En un circuito con una resistencia fija la corriente aumenta al doble ¿Qué ha ocurrido en el circuito?</w:t>
+      </w:r>
+    </w:p>
+    <w:p>
+      <w:pPr>
+        <w:pStyle w:val="Choice"/>
+      </w:pPr>
+      <w:r>
+        <w:t>a)</w:t>
+        <w:tab/>
+        <w:t>La tensión de la batería ha aumentado el doble</w:t>
+      </w:r>
+    </w:p>
+    <w:p>
+      <w:pPr>
+        <w:pStyle w:val="Choice"/>
+      </w:pPr>
+      <w:r>
+        <w:t>b)</w:t>
+        <w:tab/>
+        <w:t>La cantidad de electrones que pasan por el circuito está reduciéndose por algún motivo</w:t>
+      </w:r>
+    </w:p>
+    <w:p>
+      <w:pPr>
+        <w:pStyle w:val="Choice"/>
+      </w:pPr>
+      <w:r>
+        <w:t>c)</w:t>
+        <w:tab/>
+        <w:t>La tensión de la batería ha disminuido a la mitad</w:t>
+      </w:r>
+    </w:p>
+    <w:p>
+      <w:pPr>
+        <w:pStyle w:val="Choice"/>
+      </w:pPr>
+      <w:r>
+        <w:t>d)</w:t>
+        <w:tab/>
+        <w:t>No se puede saber sin conocer el voltaje al que está conectado el circuito</w:t>
+      </w:r>
+    </w:p>
+    <w:p>
+      <w:pPr>
+        <w:pStyle w:val="ListNumber"/>
+      </w:pPr>
+      <w:r>
+        <w:t>En un circuito con una resistencia fija la corriente disminuye a la mitad ¿Qué ha ocurrido en el circuito?</w:t>
+      </w:r>
+    </w:p>
+    <w:p>
+      <w:pPr>
+        <w:pStyle w:val="Choice"/>
+      </w:pPr>
+      <w:r>
+        <w:t>a)</w:t>
+        <w:tab/>
+        <w:t>La tensión de la batería ha aumentado el doble</w:t>
+      </w:r>
+    </w:p>
+    <w:p>
+      <w:pPr>
+        <w:pStyle w:val="Choice"/>
+      </w:pPr>
+      <w:r>
+        <w:t>b)</w:t>
+        <w:tab/>
+        <w:t>No se puede saber sin conocer el voltaje al que está conectado el circuito</w:t>
+      </w:r>
+    </w:p>
+    <w:p>
+      <w:pPr>
+        <w:pStyle w:val="Choice"/>
+      </w:pPr>
+      <w:r>
+        <w:t>c)</w:t>
+        <w:tab/>
+        <w:t>La cantidad de electrones que pasan por el circuito está aumentando por algún motivo</w:t>
+      </w:r>
+    </w:p>
+    <w:p>
+      <w:pPr>
+        <w:pStyle w:val="Choice"/>
+      </w:pPr>
+      <w:r>
+        <w:t>d)</w:t>
+        <w:tab/>
+        <w:t>La tensión de la batería ha disminuido a la mitad</w:t>
+      </w:r>
+    </w:p>
+    <w:p>
+      <w:pPr>
+        <w:pStyle w:val="ListNumber"/>
+      </w:pPr>
+      <w:r>
+        <w:t>¿Qué valor tiene la intensidad de corriente?</w:t>
+      </w:r>
+    </w:p>
+    <w:p>
+      <w:pPr>
         <w:pStyle w:val="Image"/>
       </w:pPr>
       <w:r>
         <w:drawing>
           <wp:inline xmlns:a="http://schemas.openxmlformats.org/drawingml/2006/main" xmlns:pic="http://schemas.openxmlformats.org/drawingml/2006/picture">
-            <wp:extent cx="3050847" cy="1830508"/>
+            <wp:extent cx="1842711" cy="1091920"/>
             <wp:docPr id="1" name="Picture 1"/>
             <wp:cNvGraphicFramePr>
               <a:graphicFrameLocks noChangeAspect="1"/>
@@ -34,7 +1090,7 @@
               <a:graphicData uri="http://schemas.openxmlformats.org/drawingml/2006/picture">
                 <pic:pic>
                   <pic:nvPicPr>
-                    <pic:cNvPr id="0" name="electric-voltEnA644.png"/>
+                    <pic:cNvPr id="0" name="electric-ley-ohm-01.png"/>
                     <pic:cNvPicPr/>
                   </pic:nvPicPr>
                   <pic:blipFill>
@@ -46,7 +1102,7 @@
                   <pic:spPr>
                     <a:xfrm>
                       <a:off x="0" y="0"/>
-                      <a:ext cx="3050847" cy="1830508"/>
+                      <a:ext cx="1842711" cy="1091920"/>
                     </a:xfrm>
                     <a:prstGeom prst="rect"/>
                   </pic:spPr>
@@ -64,7 +1120,7 @@
       <w:r>
         <w:t>a)</w:t>
         <w:tab/>
-        <w:t>No se puede saber sin el dato de la intensidad</w:t>
+        <w:t>12A</w:t>
       </w:r>
     </w:p>
     <w:p>
@@ -74,7 +1130,7 @@
       <w:r>
         <w:t>b)</w:t>
         <w:tab/>
-        <w:t>6V</w:t>
+        <w:t>3A</w:t>
       </w:r>
     </w:p>
     <w:p>
@@ -84,7 +1140,7 @@
       <w:r>
         <w:t>c)</w:t>
         <w:tab/>
-        <w:t>4V</w:t>
+        <w:t>0.33A</w:t>
       </w:r>
     </w:p>
     <w:p>
@@ -94,7 +1150,7 @@
       <w:r>
         <w:t>d)</w:t>
         <w:tab/>
-        <w:t>3V</w:t>
+        <w:t>2Ω</w:t>
       </w:r>
     </w:p>
     <w:p>
@@ -102,7 +1158,7 @@
         <w:pStyle w:val="ListNumber"/>
       </w:pPr>
       <w:r>
-        <w:t>¿Cuál será el voltaje en el punto 'a'?</w:t>
+        <w:t>¿Qué valor tiene la intensidad de corriente?</w:t>
       </w:r>
     </w:p>
     <w:p>
@@ -112,7 +1168,7 @@
       <w:r>
         <w:drawing>
           <wp:inline xmlns:a="http://schemas.openxmlformats.org/drawingml/2006/main" xmlns:pic="http://schemas.openxmlformats.org/drawingml/2006/picture">
-            <wp:extent cx="3050847" cy="1830508"/>
+            <wp:extent cx="1842711" cy="1091920"/>
             <wp:docPr id="2" name="Picture 2"/>
             <wp:cNvGraphicFramePr>
               <a:graphicFrameLocks noChangeAspect="1"/>
@@ -121,7 +1177,7 @@
               <a:graphicData uri="http://schemas.openxmlformats.org/drawingml/2006/picture">
                 <pic:pic>
                   <pic:nvPicPr>
-                    <pic:cNvPr id="0" name="electric-voltEnA60044.png"/>
+                    <pic:cNvPr id="0" name="electric-ley-ohm-02.png"/>
                     <pic:cNvPicPr/>
                   </pic:nvPicPr>
                   <pic:blipFill>
@@ -133,7 +1189,7 @@
                   <pic:spPr>
                     <a:xfrm>
                       <a:off x="0" y="0"/>
-                      <a:ext cx="3050847" cy="1830508"/>
+                      <a:ext cx="1842711" cy="1091920"/>
                     </a:xfrm>
                     <a:prstGeom prst="rect"/>
                   </pic:spPr>
@@ -151,7 +1207,7 @@
       <w:r>
         <w:t>a)</w:t>
         <w:tab/>
-        <w:t>400V</w:t>
+        <w:t>270A</w:t>
       </w:r>
     </w:p>
     <w:p>
@@ -161,7 +1217,7 @@
       <w:r>
         <w:t>b)</w:t>
         <w:tab/>
-        <w:t>150V</w:t>
+        <w:t>0.3A</w:t>
       </w:r>
     </w:p>
     <w:p>
@@ -171,7 +1227,7 @@
       <w:r>
         <w:t>c)</w:t>
         <w:tab/>
-        <w:t>300V</w:t>
+        <w:t>9V</w:t>
       </w:r>
     </w:p>
     <w:p>
@@ -181,7 +1237,7 @@
       <w:r>
         <w:t>d)</w:t>
         <w:tab/>
-        <w:t>3V</w:t>
+        <w:t>3.3A</w:t>
       </w:r>
     </w:p>
     <w:p>
@@ -189,7 +1245,7 @@
         <w:pStyle w:val="ListNumber"/>
       </w:pPr>
       <w:r>
-        <w:t>¿Cuál será el voltaje en el punto 'a'?</w:t>
+        <w:t>¿Qué valor tiene la intensidad de corriente?</w:t>
       </w:r>
     </w:p>
     <w:p>
@@ -199,7 +1255,7 @@
       <w:r>
         <w:drawing>
           <wp:inline xmlns:a="http://schemas.openxmlformats.org/drawingml/2006/main" xmlns:pic="http://schemas.openxmlformats.org/drawingml/2006/picture">
-            <wp:extent cx="3050847" cy="1830508"/>
+            <wp:extent cx="1842711" cy="1091920"/>
             <wp:docPr id="3" name="Picture 3"/>
             <wp:cNvGraphicFramePr>
               <a:graphicFrameLocks noChangeAspect="1"/>
@@ -208,7 +1264,7 @@
               <a:graphicData uri="http://schemas.openxmlformats.org/drawingml/2006/picture">
                 <pic:pic>
                   <pic:nvPicPr>
-                    <pic:cNvPr id="0" name="electric-voltEnA622.png"/>
+                    <pic:cNvPr id="0" name="electric-ley-ohm-07.png"/>
                     <pic:cNvPicPr/>
                   </pic:nvPicPr>
                   <pic:blipFill>
@@ -220,7 +1276,7 @@
                   <pic:spPr>
                     <a:xfrm>
                       <a:off x="0" y="0"/>
-                      <a:ext cx="3050847" cy="1830508"/>
+                      <a:ext cx="1842711" cy="1091920"/>
                     </a:xfrm>
                     <a:prstGeom prst="rect"/>
                   </pic:spPr>
@@ -238,7 +1294,7 @@
       <w:r>
         <w:t>a)</w:t>
         <w:tab/>
-        <w:t>6V</w:t>
+        <w:t>10A</w:t>
       </w:r>
     </w:p>
     <w:p>
@@ -248,7 +1304,7 @@
       <w:r>
         <w:t>b)</w:t>
         <w:tab/>
-        <w:t>2V</w:t>
+        <w:t>120Ω</w:t>
       </w:r>
     </w:p>
     <w:p>
@@ -258,7 +1314,7 @@
       <w:r>
         <w:t>c)</w:t>
         <w:tab/>
-        <w:t>3V</w:t>
+        <w:t>0.1A</w:t>
       </w:r>
     </w:p>
     <w:p>
@@ -268,7 +1324,7 @@
       <w:r>
         <w:t>d)</w:t>
         <w:tab/>
-        <w:t>4V</w:t>
+        <w:t>1440A</w:t>
       </w:r>
     </w:p>
     <w:p>
@@ -276,7 +1332,7 @@
         <w:pStyle w:val="ListNumber"/>
       </w:pPr>
       <w:r>
-        <w:t>¿Cuál será el voltaje en el punto 'a'?</w:t>
+        <w:t>¿Qué valor tiene la intensidad de corriente?</w:t>
       </w:r>
     </w:p>
     <w:p>
@@ -286,7 +1342,7 @@
       <w:r>
         <w:drawing>
           <wp:inline xmlns:a="http://schemas.openxmlformats.org/drawingml/2006/main" xmlns:pic="http://schemas.openxmlformats.org/drawingml/2006/picture">
-            <wp:extent cx="3050847" cy="1830508"/>
+            <wp:extent cx="1842711" cy="1091920"/>
             <wp:docPr id="4" name="Picture 4"/>
             <wp:cNvGraphicFramePr>
               <a:graphicFrameLocks noChangeAspect="1"/>
@@ -295,7 +1351,7 @@
               <a:graphicData uri="http://schemas.openxmlformats.org/drawingml/2006/picture">
                 <pic:pic>
                   <pic:nvPicPr>
-                    <pic:cNvPr id="0" name="electric-voltEnA62K2K.png"/>
+                    <pic:cNvPr id="0" name="electric-ley-ohm-08.png"/>
                     <pic:cNvPicPr/>
                   </pic:nvPicPr>
                   <pic:blipFill>
@@ -307,7 +1363,7 @@
                   <pic:spPr>
                     <a:xfrm>
                       <a:off x="0" y="0"/>
-                      <a:ext cx="3050847" cy="1830508"/>
+                      <a:ext cx="1842711" cy="1091920"/>
                     </a:xfrm>
                     <a:prstGeom prst="rect"/>
                   </pic:spPr>
@@ -325,7 +1381,7 @@
       <w:r>
         <w:t>a)</w:t>
         <w:tab/>
-        <w:t>0,00003V</w:t>
+        <w:t>1.5A</w:t>
       </w:r>
     </w:p>
     <w:p>
@@ -335,7 +1391,7 @@
       <w:r>
         <w:t>b)</w:t>
         <w:tab/>
-        <w:t>3V</w:t>
+        <w:t>15V</w:t>
       </w:r>
     </w:p>
     <w:p>
@@ -345,7 +1401,7 @@
       <w:r>
         <w:t>c)</w:t>
         <w:tab/>
-        <w:t>0,003V</w:t>
+        <w:t>150A</w:t>
       </w:r>
     </w:p>
     <w:p>
@@ -355,7 +1411,7 @@
       <w:r>
         <w:t>d)</w:t>
         <w:tab/>
-        <w:t>3KV</w:t>
+        <w:t>0.66A</w:t>
       </w:r>
     </w:p>
     <w:p>
@@ -363,7 +1419,7 @@
         <w:pStyle w:val="ListNumber"/>
       </w:pPr>
       <w:r>
-        <w:t>¿Cuál será el voltaje en el punto 'a'?</w:t>
+        <w:t>¿Qué valor tiene la intensidad de corriente?</w:t>
       </w:r>
     </w:p>
     <w:p>
@@ -373,7 +1429,7 @@
       <w:r>
         <w:drawing>
           <wp:inline xmlns:a="http://schemas.openxmlformats.org/drawingml/2006/main" xmlns:pic="http://schemas.openxmlformats.org/drawingml/2006/picture">
-            <wp:extent cx="3050847" cy="1830508"/>
+            <wp:extent cx="1842711" cy="1091920"/>
             <wp:docPr id="5" name="Picture 5"/>
             <wp:cNvGraphicFramePr>
               <a:graphicFrameLocks noChangeAspect="1"/>
@@ -382,7 +1438,7 @@
               <a:graphicData uri="http://schemas.openxmlformats.org/drawingml/2006/picture">
                 <pic:pic>
                   <pic:nvPicPr>
-                    <pic:cNvPr id="0" name="electric-voltEnA61K1.png"/>
+                    <pic:cNvPr id="0" name="electric-ley-ohm-13.png"/>
                     <pic:cNvPicPr/>
                   </pic:nvPicPr>
                   <pic:blipFill>
@@ -394,7 +1450,7 @@
                   <pic:spPr>
                     <a:xfrm>
                       <a:off x="0" y="0"/>
-                      <a:ext cx="3050847" cy="1830508"/>
+                      <a:ext cx="1842711" cy="1091920"/>
                     </a:xfrm>
                     <a:prstGeom prst="rect"/>
                   </pic:spPr>
@@ -412,7 +1468,7 @@
       <w:r>
         <w:t>a)</w:t>
         <w:tab/>
-        <w:t>Más de 6V</w:t>
+        <w:t>2A</w:t>
       </w:r>
     </w:p>
     <w:p>
@@ -422,7 +1478,7 @@
       <w:r>
         <w:t>b)</w:t>
         <w:tab/>
-        <w:t>Casi 6V</w:t>
+        <w:t>9Ω</w:t>
       </w:r>
     </w:p>
     <w:p>
@@ -432,7 +1488,7 @@
       <w:r>
         <w:t>c)</w:t>
         <w:tab/>
-        <w:t>Casi 0V</w:t>
+        <w:t>0.5A</w:t>
       </w:r>
     </w:p>
     <w:p>
@@ -442,7 +1498,7 @@
       <w:r>
         <w:t>d)</w:t>
         <w:tab/>
-        <w:t>Sobre 3V</w:t>
+        <w:t>162A</w:t>
       </w:r>
     </w:p>
     <w:p>
@@ -450,7 +1506,7 @@
         <w:pStyle w:val="ListNumber"/>
       </w:pPr>
       <w:r>
-        <w:t>¿Cuál será el voltaje en el punto 'a'?</w:t>
+        <w:t>¿Qué valor tiene la intensidad de corriente?</w:t>
       </w:r>
     </w:p>
     <w:p>
@@ -460,7 +1516,7 @@
       <w:r>
         <w:drawing>
           <wp:inline xmlns:a="http://schemas.openxmlformats.org/drawingml/2006/main" xmlns:pic="http://schemas.openxmlformats.org/drawingml/2006/picture">
-            <wp:extent cx="3050847" cy="1830508"/>
+            <wp:extent cx="1842711" cy="1091920"/>
             <wp:docPr id="6" name="Picture 6"/>
             <wp:cNvGraphicFramePr>
               <a:graphicFrameLocks noChangeAspect="1"/>
@@ -469,7 +1525,7 @@
               <a:graphicData uri="http://schemas.openxmlformats.org/drawingml/2006/picture">
                 <pic:pic>
                   <pic:nvPicPr>
-                    <pic:cNvPr id="0" name="electric-voltEnA611K.png"/>
+                    <pic:cNvPr id="0" name="electric-ley-ohm-14.png"/>
                     <pic:cNvPicPr/>
                   </pic:nvPicPr>
                   <pic:blipFill>
@@ -481,7 +1537,7 @@
                   <pic:spPr>
                     <a:xfrm>
                       <a:off x="0" y="0"/>
-                      <a:ext cx="3050847" cy="1830508"/>
+                      <a:ext cx="1842711" cy="1091920"/>
                     </a:xfrm>
                     <a:prstGeom prst="rect"/>
                   </pic:spPr>
@@ -499,7 +1555,7 @@
       <w:r>
         <w:t>a)</w:t>
         <w:tab/>
-        <w:t>Más de 6V</w:t>
+        <w:t>4.16A</w:t>
       </w:r>
     </w:p>
     <w:p>
@@ -509,7 +1565,7 @@
       <w:r>
         <w:t>b)</w:t>
         <w:tab/>
-        <w:t>Casi 6V</w:t>
+        <w:t>0.24A</w:t>
       </w:r>
     </w:p>
     <w:p>
@@ -519,7 +1575,7 @@
       <w:r>
         <w:t>c)</w:t>
         <w:tab/>
-        <w:t>Sobre 3V</w:t>
+        <w:t>2400A</w:t>
       </w:r>
     </w:p>
     <w:p>
@@ -529,7 +1585,7 @@
       <w:r>
         <w:t>d)</w:t>
         <w:tab/>
-        <w:t>Casi 0V</w:t>
+        <w:t>24V</w:t>
       </w:r>
     </w:p>
     <w:p>
@@ -537,7 +1593,7 @@
         <w:pStyle w:val="ListNumber"/>
       </w:pPr>
       <w:r>
-        <w:t>¿Cuál será el voltaje en el punto 'a'?</w:t>
+        <w:t>¿Qué valor tiene la tensión de la pila?</w:t>
       </w:r>
     </w:p>
     <w:p>
@@ -547,7 +1603,7 @@
       <w:r>
         <w:drawing>
           <wp:inline xmlns:a="http://schemas.openxmlformats.org/drawingml/2006/main" xmlns:pic="http://schemas.openxmlformats.org/drawingml/2006/picture">
-            <wp:extent cx="3050847" cy="1830508"/>
+            <wp:extent cx="1842711" cy="1091920"/>
             <wp:docPr id="7" name="Picture 7"/>
             <wp:cNvGraphicFramePr>
               <a:graphicFrameLocks noChangeAspect="1"/>
@@ -556,7 +1612,7 @@
               <a:graphicData uri="http://schemas.openxmlformats.org/drawingml/2006/picture">
                 <pic:pic>
                   <pic:nvPicPr>
-                    <pic:cNvPr id="0" name="electric-voltEnA642.png"/>
+                    <pic:cNvPr id="0" name="electric-ley-ohm-03.png"/>
                     <pic:cNvPicPr/>
                   </pic:nvPicPr>
                   <pic:blipFill>
@@ -568,7 +1624,7 @@
                   <pic:spPr>
                     <a:xfrm>
                       <a:off x="0" y="0"/>
-                      <a:ext cx="3050847" cy="1830508"/>
+                      <a:ext cx="1842711" cy="1091920"/>
                     </a:xfrm>
                     <a:prstGeom prst="rect"/>
                   </pic:spPr>
@@ -586,7 +1642,7 @@
       <w:r>
         <w:t>a)</w:t>
         <w:tab/>
-        <w:t>2V</w:t>
+        <w:t>15V</w:t>
       </w:r>
     </w:p>
     <w:p>
@@ -596,7 +1652,7 @@
       <w:r>
         <w:t>b)</w:t>
         <w:tab/>
-        <w:t>3V</w:t>
+        <w:t>0.06V</w:t>
       </w:r>
     </w:p>
     <w:p>
@@ -606,7 +1662,7 @@
       <w:r>
         <w:t>c)</w:t>
         <w:tab/>
-        <w:t>4V</w:t>
+        <w:t>60V</w:t>
       </w:r>
     </w:p>
     <w:p>
@@ -615,602 +1671,26 @@
       </w:pPr>
       <w:r>
         <w:t>d)</w:t>
-        <w:tab/>
-        <w:t>6V</w:t>
-      </w:r>
-    </w:p>
-    <w:p>
-      <w:pPr>
-        <w:pStyle w:val="ListNumber"/>
-      </w:pPr>
-      <w:r>
-        <w:t>¿Cuál de estas es una expresión CORRECTA de la Ley de Ohm?</w:t>
-      </w:r>
-    </w:p>
-    <w:p>
-      <w:pPr>
-        <w:pStyle w:val="Choice"/>
-      </w:pPr>
-      <w:r>
-        <w:t>a)</w:t>
-        <w:tab/>
-        <w:t>R.V=I</w:t>
-      </w:r>
-    </w:p>
-    <w:p>
-      <w:pPr>
-        <w:pStyle w:val="Choice"/>
-      </w:pPr>
-      <w:r>
-        <w:t>b)</w:t>
-        <w:tab/>
-        <w:t>R=V·I</w:t>
-      </w:r>
-    </w:p>
-    <w:p>
-      <w:pPr>
-        <w:pStyle w:val="Choice"/>
-      </w:pPr>
-      <w:r>
-        <w:t>c)</w:t>
-        <w:tab/>
-        <w:t>R=I/V</w:t>
-      </w:r>
-    </w:p>
-    <w:p>
-      <w:pPr>
-        <w:pStyle w:val="Choice"/>
-      </w:pPr>
-      <w:r>
-        <w:t>d)</w:t>
-        <w:tab/>
-        <w:t>R=V/I</w:t>
-      </w:r>
-    </w:p>
-    <w:p>
-      <w:pPr>
-        <w:pStyle w:val="ListNumber"/>
-      </w:pPr>
-      <w:r>
-        <w:t>¿Cuál de las siguientes sería una expresión incorrecta de la ley de Ohm?</w:t>
-      </w:r>
-    </w:p>
-    <w:p>
-      <w:pPr>
-        <w:pStyle w:val="Choice"/>
-      </w:pPr>
-      <w:r>
-        <w:t>a)</w:t>
-        <w:tab/>
-        <w:t>I=V/ R</w:t>
-      </w:r>
-    </w:p>
-    <w:p>
-      <w:pPr>
-        <w:pStyle w:val="Choice"/>
-      </w:pPr>
-      <w:r>
-        <w:t>b)</w:t>
-        <w:tab/>
-        <w:t>R=I.V</w:t>
-      </w:r>
-    </w:p>
-    <w:p>
-      <w:pPr>
-        <w:pStyle w:val="Choice"/>
-      </w:pPr>
-      <w:r>
-        <w:t>c)</w:t>
-        <w:tab/>
-        <w:t>I. R=V</w:t>
-      </w:r>
-    </w:p>
-    <w:p>
-      <w:pPr>
-        <w:pStyle w:val="Choice"/>
-      </w:pPr>
-      <w:r>
-        <w:t>d)</w:t>
-        <w:tab/>
-        <w:t>R=V/I</w:t>
-      </w:r>
-    </w:p>
-    <w:p>
-      <w:pPr>
-        <w:pStyle w:val="ListNumber"/>
-      </w:pPr>
-      <w:r>
-        <w:t>Tienes un circuito conectado a un voltaje de 20V por el que pasa una corriente de 10A. ¿Cuál es la resistencia que tiene ese circuito?</w:t>
-      </w:r>
-    </w:p>
-    <w:p>
-      <w:pPr>
-        <w:pStyle w:val="Choice"/>
-      </w:pPr>
-      <w:r>
-        <w:t>a)</w:t>
-        <w:tab/>
-        <w:t>0,5Ω</w:t>
-      </w:r>
-    </w:p>
-    <w:p>
-      <w:pPr>
-        <w:pStyle w:val="Choice"/>
-      </w:pPr>
-      <w:r>
-        <w:t>b)</w:t>
-        <w:tab/>
-        <w:t>1Ω</w:t>
-      </w:r>
-    </w:p>
-    <w:p>
-      <w:pPr>
-        <w:pStyle w:val="Choice"/>
-      </w:pPr>
-      <w:r>
-        <w:t>c)</w:t>
-        <w:tab/>
-        <w:t>200 Ω</w:t>
-      </w:r>
-    </w:p>
-    <w:p>
-      <w:pPr>
-        <w:pStyle w:val="Choice"/>
-      </w:pPr>
-      <w:r>
-        <w:t>d)</w:t>
-        <w:tab/>
-        <w:t>2Ω</w:t>
-      </w:r>
-    </w:p>
-    <w:p>
-      <w:pPr>
-        <w:pStyle w:val="ListNumber"/>
-      </w:pPr>
-      <w:r>
-        <w:t>La intensidad que circula por un circuito es de 2A y está alimentado a 6V. ¿Qué resistencia hay en el circuito?</w:t>
-      </w:r>
-    </w:p>
-    <w:p>
-      <w:pPr>
-        <w:pStyle w:val="Choice"/>
-      </w:pPr>
-      <w:r>
-        <w:t>a)</w:t>
-        <w:tab/>
-        <w:t>12Ω</w:t>
-      </w:r>
-    </w:p>
-    <w:p>
-      <w:pPr>
-        <w:pStyle w:val="Choice"/>
-      </w:pPr>
-      <w:r>
-        <w:t>b)</w:t>
-        <w:tab/>
-        <w:t>2/6Ω</w:t>
-      </w:r>
-    </w:p>
-    <w:p>
-      <w:pPr>
-        <w:pStyle w:val="Choice"/>
-      </w:pPr>
-      <w:r>
-        <w:t>c)</w:t>
-        <w:tab/>
-        <w:t>0,33Ω</w:t>
-      </w:r>
-    </w:p>
-    <w:p>
-      <w:pPr>
-        <w:pStyle w:val="Choice"/>
-      </w:pPr>
-      <w:r>
-        <w:t>d)</w:t>
-        <w:tab/>
-        <w:t>3Ω</w:t>
-      </w:r>
-    </w:p>
-    <w:p>
-      <w:pPr>
-        <w:pStyle w:val="ListNumber"/>
-      </w:pPr>
-      <w:r>
-        <w:t>Conecto una resistencia de 100 Ω en un circuito con una pila de 9V. ¿Qué intensidad circula?</w:t>
-      </w:r>
-    </w:p>
-    <w:p>
-      <w:pPr>
-        <w:pStyle w:val="Choice"/>
-      </w:pPr>
-      <w:r>
-        <w:t>a)</w:t>
-        <w:tab/>
-        <w:t>0,09A</w:t>
-      </w:r>
-    </w:p>
-    <w:p>
-      <w:pPr>
-        <w:pStyle w:val="Choice"/>
-      </w:pPr>
-      <w:r>
-        <w:t>b)</w:t>
-        <w:tab/>
-        <w:t>900A</w:t>
-      </w:r>
-    </w:p>
-    <w:p>
-      <w:pPr>
-        <w:pStyle w:val="Choice"/>
-      </w:pPr>
-      <w:r>
-        <w:t>c)</w:t>
-        <w:tab/>
-        <w:t>11,11A</w:t>
-      </w:r>
-    </w:p>
-    <w:p>
-      <w:pPr>
-        <w:pStyle w:val="Choice"/>
-      </w:pPr>
-      <w:r>
-        <w:t>d)</w:t>
-        <w:tab/>
-        <w:t>0,9A</w:t>
-      </w:r>
-    </w:p>
-    <w:p>
-      <w:pPr>
-        <w:pStyle w:val="ListNumber"/>
-      </w:pPr>
-      <w:r>
-        <w:t>Tienes un circuito con una resistencia de 4Ω conectado a una pila de 8V. ¿Qué intensidad circulará?</w:t>
-      </w:r>
-    </w:p>
-    <w:p>
-      <w:pPr>
-        <w:pStyle w:val="Choice"/>
-      </w:pPr>
-      <w:r>
-        <w:t>a)</w:t>
         <w:tab/>
         <w:t>2A</w:t>
       </w:r>
     </w:p>
     <w:p>
       <w:pPr>
-        <w:pStyle w:val="Choice"/>
+        <w:pStyle w:val="ListNumber"/>
       </w:pPr>
       <w:r>
-        <w:t>b)</w:t>
-        <w:tab/>
-        <w:t>12A</w:t>
+        <w:t>¿Qué valor tiene la tensión de la pila?</w:t>
       </w:r>
     </w:p>
     <w:p>
       <w:pPr>
-        <w:pStyle w:val="Choice"/>
-      </w:pPr>
-      <w:r>
-        <w:t>c)</w:t>
-        <w:tab/>
-        <w:t>0,5A</w:t>
-      </w:r>
-    </w:p>
-    <w:p>
-      <w:pPr>
-        <w:pStyle w:val="Choice"/>
-      </w:pPr>
-      <w:r>
-        <w:t>d)</w:t>
-        <w:tab/>
-        <w:t>32A</w:t>
-      </w:r>
-    </w:p>
-    <w:p>
-      <w:pPr>
-        <w:pStyle w:val="ListNumber"/>
-      </w:pPr>
-      <w:r>
-        <w:t>Tienes un circuito de resistencia de 3Ω por el que pasa una intensidad de 9A ¿A qué voltaje estará conectado ese circuito?</w:t>
-      </w:r>
-    </w:p>
-    <w:p>
-      <w:pPr>
-        <w:pStyle w:val="Choice"/>
-      </w:pPr>
-      <w:r>
-        <w:t>a)</w:t>
-        <w:tab/>
-        <w:t>3V</w:t>
-      </w:r>
-    </w:p>
-    <w:p>
-      <w:pPr>
-        <w:pStyle w:val="Choice"/>
-      </w:pPr>
-      <w:r>
-        <w:t>b)</w:t>
-        <w:tab/>
-        <w:t>12V</w:t>
-      </w:r>
-    </w:p>
-    <w:p>
-      <w:pPr>
-        <w:pStyle w:val="Choice"/>
-      </w:pPr>
-      <w:r>
-        <w:t>c)</w:t>
-        <w:tab/>
-        <w:t>27V</w:t>
-      </w:r>
-    </w:p>
-    <w:p>
-      <w:pPr>
-        <w:pStyle w:val="Choice"/>
-      </w:pPr>
-      <w:r>
-        <w:t>d)</w:t>
-        <w:tab/>
-        <w:t>0,33V</w:t>
-      </w:r>
-    </w:p>
-    <w:p>
-      <w:pPr>
-        <w:pStyle w:val="ListNumber"/>
-      </w:pPr>
-      <w:r>
-        <w:t>En un circuito con una resistencia de 100 Ω la intensidad es de 0,5A. ¿Cuál es el voltaje?</w:t>
-      </w:r>
-    </w:p>
-    <w:p>
-      <w:pPr>
-        <w:pStyle w:val="Choice"/>
-      </w:pPr>
-      <w:r>
-        <w:t>a)</w:t>
-        <w:tab/>
-        <w:t>200V</w:t>
-      </w:r>
-    </w:p>
-    <w:p>
-      <w:pPr>
-        <w:pStyle w:val="Choice"/>
-      </w:pPr>
-      <w:r>
-        <w:t>b)</w:t>
-        <w:tab/>
-        <w:t>0,005V</w:t>
-      </w:r>
-    </w:p>
-    <w:p>
-      <w:pPr>
-        <w:pStyle w:val="Choice"/>
-      </w:pPr>
-      <w:r>
-        <w:t>c)</w:t>
-        <w:tab/>
-        <w:t>50V</w:t>
-      </w:r>
-    </w:p>
-    <w:p>
-      <w:pPr>
-        <w:pStyle w:val="Choice"/>
-      </w:pPr>
-      <w:r>
-        <w:t>d)</w:t>
-        <w:tab/>
-        <w:t>5V</w:t>
-      </w:r>
-    </w:p>
-    <w:p>
-      <w:pPr>
-        <w:pStyle w:val="ListNumber"/>
-      </w:pPr>
-      <w:r>
-        <w:t>Tienes un circuito con un voltaje determinado conectado a una resistencia. Sustituyes esa resistencia por una de mayor valor, ¿qué va a pasar en el circuito?</w:t>
-      </w:r>
-    </w:p>
-    <w:p>
-      <w:pPr>
-        <w:pStyle w:val="Choice"/>
-      </w:pPr>
-      <w:r>
-        <w:t>a)</w:t>
-        <w:tab/>
-        <w:t>La cantidad de electrones que van a pasar por la resistencia cada unidad de tiempo, será menor</w:t>
-      </w:r>
-    </w:p>
-    <w:p>
-      <w:pPr>
-        <w:pStyle w:val="Choice"/>
-      </w:pPr>
-      <w:r>
-        <w:t>b)</w:t>
-        <w:tab/>
-        <w:t>La intensidad que pasa por la resistencia será mayor</w:t>
-      </w:r>
-    </w:p>
-    <w:p>
-      <w:pPr>
-        <w:pStyle w:val="Choice"/>
-      </w:pPr>
-      <w:r>
-        <w:t>c)</w:t>
-        <w:tab/>
-        <w:t>La cantidad de electrones que van a pasar por la resistencia cada unidad de tiempo no se verá afectada</w:t>
-      </w:r>
-    </w:p>
-    <w:p>
-      <w:pPr>
-        <w:pStyle w:val="Choice"/>
-      </w:pPr>
-      <w:r>
-        <w:t>d)</w:t>
-        <w:tab/>
-        <w:t>La cantidad de electrones que van a pasar por la resistencia cada unidad de tiempo, aumentará</w:t>
-      </w:r>
-    </w:p>
-    <w:p>
-      <w:pPr>
-        <w:pStyle w:val="ListNumber"/>
-      </w:pPr>
-      <w:r>
-        <w:t>Tienes un circuito con un voltaje determinado conectado a una resistencia. Sustituyes esa resistencia por una de menor valor, ¿qué va a pasar?</w:t>
-      </w:r>
-    </w:p>
-    <w:p>
-      <w:pPr>
-        <w:pStyle w:val="Choice"/>
-      </w:pPr>
-      <w:r>
-        <w:t>a)</w:t>
-        <w:tab/>
-        <w:t>La cantidad de electrones que van a pasar por la resistencia cada unidad de tiempo, disminuirá</w:t>
-      </w:r>
-    </w:p>
-    <w:p>
-      <w:pPr>
-        <w:pStyle w:val="Choice"/>
-      </w:pPr>
-      <w:r>
-        <w:t>b)</w:t>
-        <w:tab/>
-        <w:t>La intensidad que pasa por la resistencia será más pequeña</w:t>
-      </w:r>
-    </w:p>
-    <w:p>
-      <w:pPr>
-        <w:pStyle w:val="Choice"/>
-      </w:pPr>
-      <w:r>
-        <w:t>c)</w:t>
-        <w:tab/>
-        <w:t>La cantidad de electrones que van a pasar por la resistencia cada unidad de tiempo, aumentará</w:t>
-      </w:r>
-    </w:p>
-    <w:p>
-      <w:pPr>
-        <w:pStyle w:val="Choice"/>
-      </w:pPr>
-      <w:r>
-        <w:t>d)</w:t>
-        <w:tab/>
-        <w:t>La cantidad de electrones que van a pasar por la resistencia cada unidad de tiempo no se verá afectada</w:t>
-      </w:r>
-    </w:p>
-    <w:p>
-      <w:pPr>
-        <w:pStyle w:val="ListNumber"/>
-      </w:pPr>
-      <w:r>
-        <w:t>Estás midiendo la intensidad que pasa por una resistencia que no varía. En un momento determinado, observas que el valor de la intensidad reduce a la mitad. ¿Qué habrá pasado?</w:t>
-      </w:r>
-    </w:p>
-    <w:p>
-      <w:pPr>
-        <w:pStyle w:val="Choice"/>
-      </w:pPr>
-      <w:r>
-        <w:t>a)</w:t>
-        <w:tab/>
-        <w:t>No se puede saber sin conocer el voltaje a la que está conectado el circuito</w:t>
-      </w:r>
-    </w:p>
-    <w:p>
-      <w:pPr>
-        <w:pStyle w:val="Choice"/>
-      </w:pPr>
-      <w:r>
-        <w:t>b)</w:t>
-        <w:tab/>
-        <w:t>El voltaje del circuito se duplicó</w:t>
-      </w:r>
-    </w:p>
-    <w:p>
-      <w:pPr>
-        <w:pStyle w:val="Choice"/>
-      </w:pPr>
-      <w:r>
-        <w:t>c)</w:t>
-        <w:tab/>
-        <w:t>El voltaje del circuito se redujo, también, a la mitad</w:t>
-      </w:r>
-    </w:p>
-    <w:p>
-      <w:pPr>
-        <w:pStyle w:val="Choice"/>
-      </w:pPr>
-      <w:r>
-        <w:t>d)</w:t>
-        <w:tab/>
-        <w:t>La cantidad de electrones que pasan por el circuito está aumentando por algún motivo</w:t>
-      </w:r>
-    </w:p>
-    <w:p>
-      <w:pPr>
-        <w:pStyle w:val="ListNumber"/>
-      </w:pPr>
-      <w:r>
-        <w:t>Estás midiendo la intensidad que pasa por una resistencia que no varía. En un momento determinado el valor de la intensidad se duplica. ¿Qué habrá pasado?</w:t>
-      </w:r>
-    </w:p>
-    <w:p>
-      <w:pPr>
-        <w:pStyle w:val="Choice"/>
-      </w:pPr>
-      <w:r>
-        <w:t>a)</w:t>
-        <w:tab/>
-        <w:t>No se puede saber sin conocer el voltaje al que está conectado el circuito</w:t>
-      </w:r>
-    </w:p>
-    <w:p>
-      <w:pPr>
-        <w:pStyle w:val="Choice"/>
-      </w:pPr>
-      <w:r>
-        <w:t>b)</w:t>
-        <w:tab/>
-        <w:t>La cantidad de electrones que pasan por el circuito está reduciéndose por algún motivo</w:t>
-      </w:r>
-    </w:p>
-    <w:p>
-      <w:pPr>
-        <w:pStyle w:val="Choice"/>
-      </w:pPr>
-      <w:r>
-        <w:t>c)</w:t>
-        <w:tab/>
-        <w:t>El voltaje del circuito se redujo la mitad</w:t>
-      </w:r>
-    </w:p>
-    <w:p>
-      <w:pPr>
-        <w:pStyle w:val="Choice"/>
-      </w:pPr>
-      <w:r>
-        <w:t>d)</w:t>
-        <w:tab/>
-        <w:t>El voltaje del circuito se duplicó también</w:t>
-      </w:r>
-    </w:p>
-    <w:p>
-      <w:pPr>
-        <w:pStyle w:val="ListNumber"/>
-      </w:pPr>
-      <w:r>
-        <w:t>¿Por qué circuito circulará más corriente?</w:t>
-      </w:r>
-    </w:p>
-    <w:p>
-      <w:pPr>
         <w:pStyle w:val="Image"/>
       </w:pPr>
       <w:r>
         <w:drawing>
           <wp:inline xmlns:a="http://schemas.openxmlformats.org/drawingml/2006/main" xmlns:pic="http://schemas.openxmlformats.org/drawingml/2006/picture">
-            <wp:extent cx="3050847" cy="1830508"/>
+            <wp:extent cx="1842711" cy="1091920"/>
             <wp:docPr id="8" name="Picture 8"/>
             <wp:cNvGraphicFramePr>
               <a:graphicFrameLocks noChangeAspect="1"/>
@@ -1219,7 +1699,7 @@
               <a:graphicData uri="http://schemas.openxmlformats.org/drawingml/2006/picture">
                 <pic:pic>
                   <pic:nvPicPr>
-                    <pic:cNvPr id="0" name="electric-leiOhmSameVolt.png"/>
+                    <pic:cNvPr id="0" name="electric-ley-ohm-06.png"/>
                     <pic:cNvPicPr/>
                   </pic:nvPicPr>
                   <pic:blipFill>
@@ -1231,7 +1711,7 @@
                   <pic:spPr>
                     <a:xfrm>
                       <a:off x="0" y="0"/>
-                      <a:ext cx="3050847" cy="1830508"/>
+                      <a:ext cx="1842711" cy="1091920"/>
                     </a:xfrm>
                     <a:prstGeom prst="rect"/>
                   </pic:spPr>
@@ -1249,7 +1729,7 @@
       <w:r>
         <w:t>a)</w:t>
         <w:tab/>
-        <w:t>Por el 4</w:t>
+        <w:t>24V</w:t>
       </w:r>
     </w:p>
     <w:p>
@@ -1259,7 +1739,7 @@
       <w:r>
         <w:t>b)</w:t>
         <w:tab/>
-        <w:t>Por el 1</w:t>
+        <w:t>0.38V</w:t>
       </w:r>
     </w:p>
     <w:p>
@@ -1269,7 +1749,7 @@
       <w:r>
         <w:t>c)</w:t>
         <w:tab/>
-        <w:t>Por el 3</w:t>
+        <w:t>8Ω</w:t>
       </w:r>
     </w:p>
     <w:p>
@@ -1279,7 +1759,7 @@
       <w:r>
         <w:t>d)</w:t>
         <w:tab/>
-        <w:t>Por el 2</w:t>
+        <w:t>2.6V</w:t>
       </w:r>
     </w:p>
     <w:p>
@@ -1287,7 +1767,7 @@
         <w:pStyle w:val="ListNumber"/>
       </w:pPr>
       <w:r>
-        <w:t>¿Por qué circuito circulará más corriente?</w:t>
+        <w:t>¿Qué valor tiene la tensión de la pila?</w:t>
       </w:r>
     </w:p>
     <w:p>
@@ -1297,7 +1777,7 @@
       <w:r>
         <w:drawing>
           <wp:inline xmlns:a="http://schemas.openxmlformats.org/drawingml/2006/main" xmlns:pic="http://schemas.openxmlformats.org/drawingml/2006/picture">
-            <wp:extent cx="3050847" cy="1830508"/>
+            <wp:extent cx="1842711" cy="1091920"/>
             <wp:docPr id="9" name="Picture 9"/>
             <wp:cNvGraphicFramePr>
               <a:graphicFrameLocks noChangeAspect="1"/>
@@ -1306,7 +1786,7 @@
               <a:graphicData uri="http://schemas.openxmlformats.org/drawingml/2006/picture">
                 <pic:pic>
                   <pic:nvPicPr>
-                    <pic:cNvPr id="0" name="electric-leiOhmSameRes.png"/>
+                    <pic:cNvPr id="0" name="electric-ley-ohm-09.png"/>
                     <pic:cNvPicPr/>
                   </pic:nvPicPr>
                   <pic:blipFill>
@@ -1318,7 +1798,7 @@
                   <pic:spPr>
                     <a:xfrm>
                       <a:off x="0" y="0"/>
-                      <a:ext cx="3050847" cy="1830508"/>
+                      <a:ext cx="1842711" cy="1091920"/>
                     </a:xfrm>
                     <a:prstGeom prst="rect"/>
                   </pic:spPr>
@@ -1336,7 +1816,7 @@
       <w:r>
         <w:t>a)</w:t>
         <w:tab/>
-        <w:t>Por el 3</w:t>
+        <w:t>150V</w:t>
       </w:r>
     </w:p>
     <w:p>
@@ -1346,7 +1826,7 @@
       <w:r>
         <w:t>b)</w:t>
         <w:tab/>
-        <w:t>Por el 4</w:t>
+        <w:t>1.5V</w:t>
       </w:r>
     </w:p>
     <w:p>
@@ -1356,7 +1836,7 @@
       <w:r>
         <w:t>c)</w:t>
         <w:tab/>
-        <w:t>Por el 1</w:t>
+        <w:t>0.006V</w:t>
       </w:r>
     </w:p>
     <w:p>
@@ -1366,7 +1846,7 @@
       <w:r>
         <w:t>d)</w:t>
         <w:tab/>
-        <w:t>Por el 2</w:t>
+        <w:t>0.1A</w:t>
       </w:r>
     </w:p>
     <w:p>
@@ -1374,7 +1854,7 @@
         <w:pStyle w:val="ListNumber"/>
       </w:pPr>
       <w:r>
-        <w:t>¿Por qué circuito circulará más corriente?</w:t>
+        <w:t>¿Qué valor tiene la tensión de la pila?</w:t>
       </w:r>
     </w:p>
     <w:p>
@@ -1384,7 +1864,7 @@
       <w:r>
         <w:drawing>
           <wp:inline xmlns:a="http://schemas.openxmlformats.org/drawingml/2006/main" xmlns:pic="http://schemas.openxmlformats.org/drawingml/2006/picture">
-            <wp:extent cx="3050847" cy="1830508"/>
+            <wp:extent cx="1842711" cy="1091920"/>
             <wp:docPr id="10" name="Picture 10"/>
             <wp:cNvGraphicFramePr>
               <a:graphicFrameLocks noChangeAspect="1"/>
@@ -1393,7 +1873,7 @@
               <a:graphicData uri="http://schemas.openxmlformats.org/drawingml/2006/picture">
                 <pic:pic>
                   <pic:nvPicPr>
-                    <pic:cNvPr id="0" name="electric-leiOhmSameVoltDecimalOhm.png"/>
+                    <pic:cNvPr id="0" name="electric-ley-ohm-12.png"/>
                     <pic:cNvPicPr/>
                   </pic:nvPicPr>
                   <pic:blipFill>
@@ -1405,7 +1885,7 @@
                   <pic:spPr>
                     <a:xfrm>
                       <a:off x="0" y="0"/>
-                      <a:ext cx="3050847" cy="1830508"/>
+                      <a:ext cx="1842711" cy="1091920"/>
                     </a:xfrm>
                     <a:prstGeom prst="rect"/>
                   </pic:spPr>
@@ -1423,7 +1903,7 @@
       <w:r>
         <w:t>a)</w:t>
         <w:tab/>
-        <w:t>Por el 2</w:t>
+        <w:t>0.002V</w:t>
       </w:r>
     </w:p>
     <w:p>
@@ -1433,7 +1913,7 @@
       <w:r>
         <w:t>b)</w:t>
         <w:tab/>
-        <w:t>Por el 3</w:t>
+        <w:t>100Ω</w:t>
       </w:r>
     </w:p>
     <w:p>
@@ -1443,7 +1923,7 @@
       <w:r>
         <w:t>c)</w:t>
         <w:tab/>
-        <w:t>Por el 4</w:t>
+        <w:t>20V</w:t>
       </w:r>
     </w:p>
     <w:p>
@@ -1453,7 +1933,7 @@
       <w:r>
         <w:t>d)</w:t>
         <w:tab/>
-        <w:t>Por el 1</w:t>
+        <w:t>500V</w:t>
       </w:r>
     </w:p>
     <w:p>
@@ -1461,7 +1941,7 @@
         <w:pStyle w:val="ListNumber"/>
       </w:pPr>
       <w:r>
-        <w:t>¿Por qué circuito circulará más corriente?</w:t>
+        <w:t>¿Qué valor tiene la tensión de la pila?</w:t>
       </w:r>
     </w:p>
     <w:p>
@@ -1471,7 +1951,7 @@
       <w:r>
         <w:drawing>
           <wp:inline xmlns:a="http://schemas.openxmlformats.org/drawingml/2006/main" xmlns:pic="http://schemas.openxmlformats.org/drawingml/2006/picture">
-            <wp:extent cx="3050847" cy="1830508"/>
+            <wp:extent cx="1842711" cy="1091920"/>
             <wp:docPr id="11" name="Picture 11"/>
             <wp:cNvGraphicFramePr>
               <a:graphicFrameLocks noChangeAspect="1"/>
@@ -1480,7 +1960,7 @@
               <a:graphicData uri="http://schemas.openxmlformats.org/drawingml/2006/picture">
                 <pic:pic>
                   <pic:nvPicPr>
-                    <pic:cNvPr id="0" name="electric-leiOhmSameVoltKohm.png"/>
+                    <pic:cNvPr id="0" name="electric-ley-ohm-15.png"/>
                     <pic:cNvPicPr/>
                   </pic:nvPicPr>
                   <pic:blipFill>
@@ -1492,7 +1972,7 @@
                   <pic:spPr>
                     <a:xfrm>
                       <a:off x="0" y="0"/>
-                      <a:ext cx="3050847" cy="1830508"/>
+                      <a:ext cx="1842711" cy="1091920"/>
                     </a:xfrm>
                     <a:prstGeom prst="rect"/>
                   </pic:spPr>
@@ -1510,7 +1990,7 @@
       <w:r>
         <w:t>a)</w:t>
         <w:tab/>
-        <w:t>Por el 3</w:t>
+        <w:t>3V</w:t>
       </w:r>
     </w:p>
     <w:p>
@@ -1520,7 +2000,7 @@
       <w:r>
         <w:t>b)</w:t>
         <w:tab/>
-        <w:t>Por el 1</w:t>
+        <w:t>1200V</w:t>
       </w:r>
     </w:p>
     <w:p>
@@ -1530,7 +2010,7 @@
       <w:r>
         <w:t>c)</w:t>
         <w:tab/>
-        <w:t>Por el 4</w:t>
+        <w:t>8V</w:t>
       </w:r>
     </w:p>
     <w:p>
@@ -1540,7 +2020,7 @@
       <w:r>
         <w:t>d)</w:t>
         <w:tab/>
-        <w:t>Por el 2</w:t>
+        <w:t>0.05A</w:t>
       </w:r>
     </w:p>
     <w:p>
@@ -1548,7 +2028,7 @@
         <w:pStyle w:val="ListNumber"/>
       </w:pPr>
       <w:r>
-        <w:t>¿Por qué circuito circulará más corriente?</w:t>
+        <w:t>¿Qué valor tiene la tensión de la pila?</w:t>
       </w:r>
     </w:p>
     <w:p>
@@ -1558,7 +2038,7 @@
       <w:r>
         <w:drawing>
           <wp:inline xmlns:a="http://schemas.openxmlformats.org/drawingml/2006/main" xmlns:pic="http://schemas.openxmlformats.org/drawingml/2006/picture">
-            <wp:extent cx="3050847" cy="1830508"/>
+            <wp:extent cx="1842711" cy="1091920"/>
             <wp:docPr id="12" name="Picture 12"/>
             <wp:cNvGraphicFramePr>
               <a:graphicFrameLocks noChangeAspect="1"/>
@@ -1567,7 +2047,7 @@
               <a:graphicData uri="http://schemas.openxmlformats.org/drawingml/2006/picture">
                 <pic:pic>
                   <pic:nvPicPr>
-                    <pic:cNvPr id="0" name="electric-leiOhmDifVoltDifRes.png"/>
+                    <pic:cNvPr id="0" name="electric-ley-ohm-18.png"/>
                     <pic:cNvPicPr/>
                   </pic:nvPicPr>
                   <pic:blipFill>
@@ -1579,7 +2059,7 @@
                   <pic:spPr>
                     <a:xfrm>
                       <a:off x="0" y="0"/>
-                      <a:ext cx="3050847" cy="1830508"/>
+                      <a:ext cx="1842711" cy="1091920"/>
                     </a:xfrm>
                     <a:prstGeom prst="rect"/>
                   </pic:spPr>
@@ -1597,7 +2077,7 @@
       <w:r>
         <w:t>a)</w:t>
         <w:tab/>
-        <w:t>Por el 4</w:t>
+        <w:t>0.05V</w:t>
       </w:r>
     </w:p>
     <w:p>
@@ -1607,7 +2087,7 @@
       <w:r>
         <w:t>b)</w:t>
         <w:tab/>
-        <w:t>Por el 3</w:t>
+        <w:t>5V</w:t>
       </w:r>
     </w:p>
     <w:p>
@@ -1617,7 +2097,7 @@
       <w:r>
         <w:t>c)</w:t>
         <w:tab/>
-        <w:t>Por el 2</w:t>
+        <w:t>20V</w:t>
       </w:r>
     </w:p>
     <w:p>
@@ -1627,7 +2107,529 @@
       <w:r>
         <w:t>d)</w:t>
         <w:tab/>
-        <w:t>Por el 1</w:t>
+        <w:t>10Ω</w:t>
+      </w:r>
+    </w:p>
+    <w:p>
+      <w:pPr>
+        <w:pStyle w:val="ListNumber"/>
+      </w:pPr>
+      <w:r>
+        <w:t>¿Qué valor tiene la resistencia?</w:t>
+      </w:r>
+    </w:p>
+    <w:p>
+      <w:pPr>
+        <w:pStyle w:val="Image"/>
+      </w:pPr>
+      <w:r>
+        <w:drawing>
+          <wp:inline xmlns:a="http://schemas.openxmlformats.org/drawingml/2006/main" xmlns:pic="http://schemas.openxmlformats.org/drawingml/2006/picture">
+            <wp:extent cx="1842711" cy="1091920"/>
+            <wp:docPr id="13" name="Picture 13"/>
+            <wp:cNvGraphicFramePr>
+              <a:graphicFrameLocks noChangeAspect="1"/>
+            </wp:cNvGraphicFramePr>
+            <a:graphic>
+              <a:graphicData uri="http://schemas.openxmlformats.org/drawingml/2006/picture">
+                <pic:pic>
+                  <pic:nvPicPr>
+                    <pic:cNvPr id="0" name="electric-ley-ohm-04.png"/>
+                    <pic:cNvPicPr/>
+                  </pic:nvPicPr>
+                  <pic:blipFill>
+                    <a:blip r:embed="rId21"/>
+                    <a:stretch>
+                      <a:fillRect/>
+                    </a:stretch>
+                  </pic:blipFill>
+                  <pic:spPr>
+                    <a:xfrm>
+                      <a:off x="0" y="0"/>
+                      <a:ext cx="1842711" cy="1091920"/>
+                    </a:xfrm>
+                    <a:prstGeom prst="rect"/>
+                  </pic:spPr>
+                </pic:pic>
+              </a:graphicData>
+            </a:graphic>
+          </wp:inline>
+        </w:drawing>
+      </w:r>
+    </w:p>
+    <w:p>
+      <w:pPr>
+        <w:pStyle w:val="Choice"/>
+      </w:pPr>
+      <w:r>
+        <w:t>a)</w:t>
+        <w:tab/>
+        <w:t>16Ω</w:t>
+      </w:r>
+    </w:p>
+    <w:p>
+      <w:pPr>
+        <w:pStyle w:val="Choice"/>
+      </w:pPr>
+      <w:r>
+        <w:t>b)</w:t>
+        <w:tab/>
+        <w:t>6V</w:t>
+      </w:r>
+    </w:p>
+    <w:p>
+      <w:pPr>
+        <w:pStyle w:val="Choice"/>
+      </w:pPr>
+      <w:r>
+        <w:t>c)</w:t>
+        <w:tab/>
+        <w:t>60Ω</w:t>
+      </w:r>
+    </w:p>
+    <w:p>
+      <w:pPr>
+        <w:pStyle w:val="Choice"/>
+      </w:pPr>
+      <w:r>
+        <w:t>d)</w:t>
+        <w:tab/>
+        <w:t>0.6Ω</w:t>
+      </w:r>
+    </w:p>
+    <w:p>
+      <w:pPr>
+        <w:pStyle w:val="ListNumber"/>
+      </w:pPr>
+      <w:r>
+        <w:t>¿Qué valor tiene la resistencia?</w:t>
+      </w:r>
+    </w:p>
+    <w:p>
+      <w:pPr>
+        <w:pStyle w:val="Image"/>
+      </w:pPr>
+      <w:r>
+        <w:drawing>
+          <wp:inline xmlns:a="http://schemas.openxmlformats.org/drawingml/2006/main" xmlns:pic="http://schemas.openxmlformats.org/drawingml/2006/picture">
+            <wp:extent cx="1842711" cy="1091920"/>
+            <wp:docPr id="14" name="Picture 14"/>
+            <wp:cNvGraphicFramePr>
+              <a:graphicFrameLocks noChangeAspect="1"/>
+            </wp:cNvGraphicFramePr>
+            <a:graphic>
+              <a:graphicData uri="http://schemas.openxmlformats.org/drawingml/2006/picture">
+                <pic:pic>
+                  <pic:nvPicPr>
+                    <pic:cNvPr id="0" name="electric-ley-ohm-05.png"/>
+                    <pic:cNvPicPr/>
+                  </pic:nvPicPr>
+                  <pic:blipFill>
+                    <a:blip r:embed="rId22"/>
+                    <a:stretch>
+                      <a:fillRect/>
+                    </a:stretch>
+                  </pic:blipFill>
+                  <pic:spPr>
+                    <a:xfrm>
+                      <a:off x="0" y="0"/>
+                      <a:ext cx="1842711" cy="1091920"/>
+                    </a:xfrm>
+                    <a:prstGeom prst="rect"/>
+                  </pic:spPr>
+                </pic:pic>
+              </a:graphicData>
+            </a:graphic>
+          </wp:inline>
+        </w:drawing>
+      </w:r>
+    </w:p>
+    <w:p>
+      <w:pPr>
+        <w:pStyle w:val="Choice"/>
+      </w:pPr>
+      <w:r>
+        <w:t>a)</w:t>
+        <w:tab/>
+        <w:t>3A</w:t>
+      </w:r>
+    </w:p>
+    <w:p>
+      <w:pPr>
+        <w:pStyle w:val="Choice"/>
+      </w:pPr>
+      <w:r>
+        <w:t>b)</w:t>
+        <w:tab/>
+        <w:t>0.33Ω</w:t>
+      </w:r>
+    </w:p>
+    <w:p>
+      <w:pPr>
+        <w:pStyle w:val="Choice"/>
+      </w:pPr>
+      <w:r>
+        <w:t>c)</w:t>
+        <w:tab/>
+        <w:t>3Ω</w:t>
+      </w:r>
+    </w:p>
+    <w:p>
+      <w:pPr>
+        <w:pStyle w:val="Choice"/>
+      </w:pPr>
+      <w:r>
+        <w:t>d)</w:t>
+        <w:tab/>
+        <w:t>27Ω</w:t>
+      </w:r>
+    </w:p>
+    <w:p>
+      <w:pPr>
+        <w:pStyle w:val="ListNumber"/>
+      </w:pPr>
+      <w:r>
+        <w:t>¿Qué valor tiene la resistencia?</w:t>
+      </w:r>
+    </w:p>
+    <w:p>
+      <w:pPr>
+        <w:pStyle w:val="Image"/>
+      </w:pPr>
+      <w:r>
+        <w:drawing>
+          <wp:inline xmlns:a="http://schemas.openxmlformats.org/drawingml/2006/main" xmlns:pic="http://schemas.openxmlformats.org/drawingml/2006/picture">
+            <wp:extent cx="1842711" cy="1091920"/>
+            <wp:docPr id="15" name="Picture 15"/>
+            <wp:cNvGraphicFramePr>
+              <a:graphicFrameLocks noChangeAspect="1"/>
+            </wp:cNvGraphicFramePr>
+            <a:graphic>
+              <a:graphicData uri="http://schemas.openxmlformats.org/drawingml/2006/picture">
+                <pic:pic>
+                  <pic:nvPicPr>
+                    <pic:cNvPr id="0" name="electric-ley-ohm-10.png"/>
+                    <pic:cNvPicPr/>
+                  </pic:nvPicPr>
+                  <pic:blipFill>
+                    <a:blip r:embed="rId23"/>
+                    <a:stretch>
+                      <a:fillRect/>
+                    </a:stretch>
+                  </pic:blipFill>
+                  <pic:spPr>
+                    <a:xfrm>
+                      <a:off x="0" y="0"/>
+                      <a:ext cx="1842711" cy="1091920"/>
+                    </a:xfrm>
+                    <a:prstGeom prst="rect"/>
+                  </pic:spPr>
+                </pic:pic>
+              </a:graphicData>
+            </a:graphic>
+          </wp:inline>
+        </w:drawing>
+      </w:r>
+    </w:p>
+    <w:p>
+      <w:pPr>
+        <w:pStyle w:val="Choice"/>
+      </w:pPr>
+      <w:r>
+        <w:t>a)</w:t>
+        <w:tab/>
+        <w:t>6Ω</w:t>
+      </w:r>
+    </w:p>
+    <w:p>
+      <w:pPr>
+        <w:pStyle w:val="Choice"/>
+      </w:pPr>
+      <w:r>
+        <w:t>b)</w:t>
+        <w:tab/>
+        <w:t>12V</w:t>
+      </w:r>
+    </w:p>
+    <w:p>
+      <w:pPr>
+        <w:pStyle w:val="Choice"/>
+      </w:pPr>
+      <w:r>
+        <w:t>c)</w:t>
+        <w:tab/>
+        <w:t>24Ω</w:t>
+      </w:r>
+    </w:p>
+    <w:p>
+      <w:pPr>
+        <w:pStyle w:val="Choice"/>
+      </w:pPr>
+      <w:r>
+        <w:t>d)</w:t>
+        <w:tab/>
+        <w:t>0.04Ω</w:t>
+      </w:r>
+    </w:p>
+    <w:p>
+      <w:pPr>
+        <w:pStyle w:val="ListNumber"/>
+      </w:pPr>
+      <w:r>
+        <w:t>¿Qué valor tiene la resistencia?</w:t>
+      </w:r>
+    </w:p>
+    <w:p>
+      <w:pPr>
+        <w:pStyle w:val="Image"/>
+      </w:pPr>
+      <w:r>
+        <w:drawing>
+          <wp:inline xmlns:a="http://schemas.openxmlformats.org/drawingml/2006/main" xmlns:pic="http://schemas.openxmlformats.org/drawingml/2006/picture">
+            <wp:extent cx="1842711" cy="1091920"/>
+            <wp:docPr id="16" name="Picture 16"/>
+            <wp:cNvGraphicFramePr>
+              <a:graphicFrameLocks noChangeAspect="1"/>
+            </wp:cNvGraphicFramePr>
+            <a:graphic>
+              <a:graphicData uri="http://schemas.openxmlformats.org/drawingml/2006/picture">
+                <pic:pic>
+                  <pic:nvPicPr>
+                    <pic:cNvPr id="0" name="electric-ley-ohm-11.png"/>
+                    <pic:cNvPicPr/>
+                  </pic:nvPicPr>
+                  <pic:blipFill>
+                    <a:blip r:embed="rId24"/>
+                    <a:stretch>
+                      <a:fillRect/>
+                    </a:stretch>
+                  </pic:blipFill>
+                  <pic:spPr>
+                    <a:xfrm>
+                      <a:off x="0" y="0"/>
+                      <a:ext cx="1842711" cy="1091920"/>
+                    </a:xfrm>
+                    <a:prstGeom prst="rect"/>
+                  </pic:spPr>
+                </pic:pic>
+              </a:graphicData>
+            </a:graphic>
+          </wp:inline>
+        </w:drawing>
+      </w:r>
+    </w:p>
+    <w:p>
+      <w:pPr>
+        <w:pStyle w:val="Choice"/>
+      </w:pPr>
+      <w:r>
+        <w:t>a)</w:t>
+        <w:tab/>
+        <w:t>0.45Ω</w:t>
+      </w:r>
+    </w:p>
+    <w:p>
+      <w:pPr>
+        <w:pStyle w:val="Choice"/>
+      </w:pPr>
+      <w:r>
+        <w:t>b)</w:t>
+        <w:tab/>
+        <w:t>15Ω</w:t>
+      </w:r>
+    </w:p>
+    <w:p>
+      <w:pPr>
+        <w:pStyle w:val="Choice"/>
+      </w:pPr>
+      <w:r>
+        <w:t>c)</w:t>
+        <w:tab/>
+        <w:t>0.03A</w:t>
+      </w:r>
+    </w:p>
+    <w:p>
+      <w:pPr>
+        <w:pStyle w:val="Choice"/>
+      </w:pPr>
+      <w:r>
+        <w:t>d)</w:t>
+        <w:tab/>
+        <w:t>500Ω</w:t>
+      </w:r>
+    </w:p>
+    <w:p>
+      <w:pPr>
+        <w:pStyle w:val="ListNumber"/>
+      </w:pPr>
+      <w:r>
+        <w:t>¿Qué valor tiene la resistencia?</w:t>
+      </w:r>
+    </w:p>
+    <w:p>
+      <w:pPr>
+        <w:pStyle w:val="Image"/>
+      </w:pPr>
+      <w:r>
+        <w:drawing>
+          <wp:inline xmlns:a="http://schemas.openxmlformats.org/drawingml/2006/main" xmlns:pic="http://schemas.openxmlformats.org/drawingml/2006/picture">
+            <wp:extent cx="1842711" cy="1091920"/>
+            <wp:docPr id="17" name="Picture 17"/>
+            <wp:cNvGraphicFramePr>
+              <a:graphicFrameLocks noChangeAspect="1"/>
+            </wp:cNvGraphicFramePr>
+            <a:graphic>
+              <a:graphicData uri="http://schemas.openxmlformats.org/drawingml/2006/picture">
+                <pic:pic>
+                  <pic:nvPicPr>
+                    <pic:cNvPr id="0" name="electric-ley-ohm-16.png"/>
+                    <pic:cNvPicPr/>
+                  </pic:nvPicPr>
+                  <pic:blipFill>
+                    <a:blip r:embed="rId25"/>
+                    <a:stretch>
+                      <a:fillRect/>
+                    </a:stretch>
+                  </pic:blipFill>
+                  <pic:spPr>
+                    <a:xfrm>
+                      <a:off x="0" y="0"/>
+                      <a:ext cx="1842711" cy="1091920"/>
+                    </a:xfrm>
+                    <a:prstGeom prst="rect"/>
+                  </pic:spPr>
+                </pic:pic>
+              </a:graphicData>
+            </a:graphic>
+          </wp:inline>
+        </w:drawing>
+      </w:r>
+    </w:p>
+    <w:p>
+      <w:pPr>
+        <w:pStyle w:val="Choice"/>
+      </w:pPr>
+      <w:r>
+        <w:t>a)</w:t>
+        <w:tab/>
+        <w:t>18V</w:t>
+      </w:r>
+    </w:p>
+    <w:p>
+      <w:pPr>
+        <w:pStyle w:val="Choice"/>
+      </w:pPr>
+      <w:r>
+        <w:t>b)</w:t>
+        <w:tab/>
+        <w:t>36Ω</w:t>
+      </w:r>
+    </w:p>
+    <w:p>
+      <w:pPr>
+        <w:pStyle w:val="Choice"/>
+      </w:pPr>
+      <w:r>
+        <w:t>c)</w:t>
+        <w:tab/>
+        <w:t>9Ω</w:t>
+      </w:r>
+    </w:p>
+    <w:p>
+      <w:pPr>
+        <w:pStyle w:val="Choice"/>
+      </w:pPr>
+      <w:r>
+        <w:t>d)</w:t>
+        <w:tab/>
+        <w:t>0.11Ω</w:t>
+      </w:r>
+    </w:p>
+    <w:p>
+      <w:pPr>
+        <w:pStyle w:val="ListNumber"/>
+      </w:pPr>
+      <w:r>
+        <w:t>¿Qué valor tiene la resistencia?</w:t>
+      </w:r>
+    </w:p>
+    <w:p>
+      <w:pPr>
+        <w:pStyle w:val="Image"/>
+      </w:pPr>
+      <w:r>
+        <w:drawing>
+          <wp:inline xmlns:a="http://schemas.openxmlformats.org/drawingml/2006/main" xmlns:pic="http://schemas.openxmlformats.org/drawingml/2006/picture">
+            <wp:extent cx="1842711" cy="1091920"/>
+            <wp:docPr id="18" name="Picture 18"/>
+            <wp:cNvGraphicFramePr>
+              <a:graphicFrameLocks noChangeAspect="1"/>
+            </wp:cNvGraphicFramePr>
+            <a:graphic>
+              <a:graphicData uri="http://schemas.openxmlformats.org/drawingml/2006/picture">
+                <pic:pic>
+                  <pic:nvPicPr>
+                    <pic:cNvPr id="0" name="electric-ley-ohm-17.png"/>
+                    <pic:cNvPicPr/>
+                  </pic:nvPicPr>
+                  <pic:blipFill>
+                    <a:blip r:embed="rId26"/>
+                    <a:stretch>
+                      <a:fillRect/>
+                    </a:stretch>
+                  </pic:blipFill>
+                  <pic:spPr>
+                    <a:xfrm>
+                      <a:off x="0" y="0"/>
+                      <a:ext cx="1842711" cy="1091920"/>
+                    </a:xfrm>
+                    <a:prstGeom prst="rect"/>
+                  </pic:spPr>
+                </pic:pic>
+              </a:graphicData>
+            </a:graphic>
+          </wp:inline>
+        </w:drawing>
+      </w:r>
+    </w:p>
+    <w:p>
+      <w:pPr>
+        <w:pStyle w:val="Choice"/>
+      </w:pPr>
+      <w:r>
+        <w:t>a)</w:t>
+        <w:tab/>
+        <w:t>0.16Ω</w:t>
+      </w:r>
+    </w:p>
+    <w:p>
+      <w:pPr>
+        <w:pStyle w:val="Choice"/>
+      </w:pPr>
+      <w:r>
+        <w:t>b)</w:t>
+        <w:tab/>
+        <w:t>4A</w:t>
+      </w:r>
+    </w:p>
+    <w:p>
+      <w:pPr>
+        <w:pStyle w:val="Choice"/>
+      </w:pPr>
+      <w:r>
+        <w:t>c)</w:t>
+        <w:tab/>
+        <w:t>96Ω</w:t>
+      </w:r>
+    </w:p>
+    <w:p>
+      <w:pPr>
+        <w:pStyle w:val="Choice"/>
+      </w:pPr>
+      <w:r>
+        <w:t>d)</w:t>
+        <w:tab/>
+        <w:t>6Ω</w:t>
       </w:r>
     </w:p>
     <w:sectPr>

</xml_diff>